<commit_message>
Update report cover with full institute name
Replace "INSTITUT ISMAGI" on the cover with the full name:
Institut Supérieur de Management, d'Administration et de Génie
Informatique (ISMAGI).

Co-Authored-By: Claude Opus 4.8 <noreply@anthropic.com>
Claude-Session: https://claude.ai/code/session_014yuHwbWoTnAJdtDhfAkid4
</commit_message>
<xml_diff>
--- a/quiz-game/Rapport_ISMAGI_Quiz_Game.docx
+++ b/quiz-game/Rapport_ISMAGI_Quiz_Game.docx
@@ -13,9 +13,9 @@
           <w:b/>
           <w:i w:val="0"/>
           <w:color w:val="666688"/>
-          <w:sz w:val="26"/>
-        </w:rPr>
-        <w:t>INSTITUT ISMAGI</w:t>
+          <w:sz w:val="24"/>
+        </w:rPr>
+        <w:t>Institut Supérieur de Management, d'Administration et de Génie Informatique (ISMAGI)</w:t>
       </w:r>
     </w:p>
     <w:p>

</xml_diff>

<commit_message>
Fix ISMAGI meaning in quiz answer across all versions
Correct the answer to "What does ISMAGI stand for?" — replace the
placeholder with the real name: Institut Supérieur de Management,
d'Administration et de Génie Informatique (initials spell I-S-M-A-G-I).

Updated everywhere: script.js, standalone HTML, dist build, C version,
tutorial mini-version + doc, HTML report, and regenerated the Word report.

Co-Authored-By: Claude Opus 4.8 <noreply@anthropic.com>
Claude-Session: https://claude.ai/code/session_014yuHwbWoTnAJdtDhfAkid4
</commit_message>
<xml_diff>
--- a/quiz-game/Rapport_ISMAGI_Quiz_Game.docx
+++ b/quiz-game/Rapport_ISMAGI_Quiz_Game.docx
@@ -8092,7 +8092,7 @@
           <w:sz w:val="18"/>
           <w:rFonts w:ascii="Consolas" w:hAnsi="Consolas"/>
         </w:rPr>
-        <w:t xml:space="preserve">      {q:"What does ISMAGI stand for?",options:["Institute of Science Mathematics and Applied Computer Science","International School of Management and AI","Institute of Sport and Gaming","Information System Modern Academy"],correct:0},</w:t>
+        <w:t xml:space="preserve">      {q:"What does ISMAGI stand for?",options:["Institut Supérieur de Management, d'Administration et de Génie Informatique","International School of Management and AI","Institute of Sport and Gaming","Information System Modern Academy"],correct:0},</w:t>
       </w:r>
     </w:p>
     <w:p>
@@ -8347,7 +8347,7 @@
           <w:sz w:val="18"/>
           <w:rFonts w:ascii="Consolas" w:hAnsi="Consolas"/>
         </w:rPr>
-        <w:t xml:space="preserve">      {q:"Que signifie ISMAGI ?",options:["Institut des Sciences Mathématiques et Informatique Appliquée","École Internationale de Management et d'IA","Institut du Sport et du Gaming","Système d'Information Académique Moderne"],correct:0},</w:t>
+        <w:t xml:space="preserve">      {q:"Que signifie ISMAGI ?",options:["Institut Supérieur de Management, d'Administration et de Génie Informatique","École Internationale de Management et d'IA","Institut du Sport et du Gaming","Système d'Information Académique Moderne"],correct:0},</w:t>
       </w:r>
     </w:p>
     <w:p>
@@ -8602,7 +8602,7 @@
           <w:sz w:val="18"/>
           <w:rFonts w:ascii="Consolas" w:hAnsi="Consolas"/>
         </w:rPr>
-        <w:t xml:space="preserve">      {q:"ماذا يعني اختصار ISMAGI؟",options:["معهد العلوم والرياضيات وعلوم الحاسوب التطبيقية","المدرسة الدولية للإدارة والذكاء الاصطناعي","معهد الرياضة والألعاب","نظام المعلومات الأكاديمية الحديثة"],correct:0},</w:t>
+        <w:t xml:space="preserve">      {q:"ماذا يعني اختصار ISMAGI؟",options:["Institut Supérieur de Management, d'Administration et de Génie Informatique","المدرسة الدولية للإدارة والذكاء الاصطناعي","معهد الرياضة والألعاب","نظام المعلومات الأكاديمية الحديثة"],correct:0},</w:t>
       </w:r>
     </w:p>
     <w:p>

</xml_diff>

<commit_message>
Update report: filled sommaire, prof name, no page numbers
- Sommaire now lists the actual contents (Remerciements, Introduction,
  Chapitres 1-4 with subsections, Conclusion, Annexe, Webographie)
  instead of an empty TOC field.
- Encadré par: Professeur Zidane Issam Eddine (updated everywhere).
- Removed page numbering from the footer.

Co-Authored-By: Claude Opus 4.8 <noreply@anthropic.com>
Claude-Session: https://claude.ai/code/session_014yuHwbWoTnAJdtDhfAkid4
</commit_message>
<xml_diff>
--- a/quiz-game/Rapport_ISMAGI_Quiz_Game.docx
+++ b/quiz-game/Rapport_ISMAGI_Quiz_Game.docx
@@ -156,7 +156,7 @@
                 <w:color w:val="5B4BD6"/>
                 <w:sz w:val="24"/>
               </w:rPr>
-              <w:t>Professeur Zidan</w:t>
+              <w:t>Professeur Zidane Issam Eddine</w:t>
             </w:r>
           </w:p>
         </w:tc>
@@ -216,7 +216,7 @@
           <w:i w:val="0"/>
           <w:sz w:val="22"/>
         </w:rPr>
-        <w:t>Avant toute chose, nous tenons à exprimer nos sincères remerciements à notre professeur, Monsieur Zidan, pour son encadrement de qualité, ses conseils précieux, sa patience et sa disponibilité tout au long de la réalisation de ce projet. Ses orientations nous ont été d'une grande aide pour mener à bien ce travail.</w:t>
+        <w:t>Avant toute chose, nous tenons à exprimer nos sincères remerciements à notre professeur, Monsieur Zidane Issam Eddine, pour son encadrement de qualité, ses conseils précieux, sa patience et sa disponibilité tout au long de la réalisation de ce projet. Ses orientations nous ont été d'une grande aide pour mener à bien ce travail.</w:t>
       </w:r>
     </w:p>
     <w:p>
@@ -264,12 +264,458 @@
       </w:r>
     </w:p>
     <w:p>
-      <w:r>
-        <w:fldChar w:fldCharType="begin"/>
-        <w:instrText xml:space="preserve">TOC \o "1-3" \h \z \u</w:instrText>
-        <w:fldChar w:fldCharType="separate"/>
-        <w:t>  (Clic droit sur le sommaire puis « Mettre à jour les champs » pour afficher les pages.)</w:t>
-        <w:fldChar w:fldCharType="end"/>
+      <w:pPr>
+        <w:spacing w:before="140" w:after="40"/>
+      </w:pPr>
+      <w:r>
+        <w:rPr>
+          <w:b/>
+          <w:color w:val="5B4BD6"/>
+          <w:sz w:val="24"/>
+        </w:rPr>
+        <w:t>Remerciements</w:t>
+      </w:r>
+    </w:p>
+    <w:p>
+      <w:pPr>
+        <w:spacing w:before="140" w:after="40"/>
+      </w:pPr>
+      <w:r>
+        <w:rPr>
+          <w:b/>
+          <w:color w:val="5B4BD6"/>
+          <w:sz w:val="24"/>
+        </w:rPr>
+        <w:t>Introduction générale</w:t>
+      </w:r>
+    </w:p>
+    <w:p>
+      <w:pPr>
+        <w:spacing w:before="140" w:after="40"/>
+      </w:pPr>
+      <w:r>
+        <w:rPr>
+          <w:b/>
+          <w:color w:val="5B4BD6"/>
+          <w:sz w:val="24"/>
+        </w:rPr>
+        <w:t>Chapitre 1 : Présentation générale du projet</w:t>
+      </w:r>
+    </w:p>
+    <w:p>
+      <w:pPr>
+        <w:spacing w:before="0" w:after="0"/>
+        <w:ind w:left="624"/>
+      </w:pPr>
+      <w:r>
+        <w:rPr>
+          <w:color w:val="444455"/>
+          <w:sz w:val="21"/>
+        </w:rPr>
+        <w:t>1.1  Contexte du projet</w:t>
+      </w:r>
+    </w:p>
+    <w:p>
+      <w:pPr>
+        <w:spacing w:before="0" w:after="0"/>
+        <w:ind w:left="624"/>
+      </w:pPr>
+      <w:r>
+        <w:rPr>
+          <w:color w:val="444455"/>
+          <w:sz w:val="21"/>
+        </w:rPr>
+        <w:t>1.2  Problématique</w:t>
+      </w:r>
+    </w:p>
+    <w:p>
+      <w:pPr>
+        <w:spacing w:before="0" w:after="0"/>
+        <w:ind w:left="624"/>
+      </w:pPr>
+      <w:r>
+        <w:rPr>
+          <w:color w:val="444455"/>
+          <w:sz w:val="21"/>
+        </w:rPr>
+        <w:t>1.3  Objectifs du projet</w:t>
+      </w:r>
+    </w:p>
+    <w:p>
+      <w:pPr>
+        <w:spacing w:before="0" w:after="0"/>
+        <w:ind w:left="624"/>
+      </w:pPr>
+      <w:r>
+        <w:rPr>
+          <w:color w:val="444455"/>
+          <w:sz w:val="21"/>
+        </w:rPr>
+        <w:t>1.4  Présentation de l'application « ISMAGI Quiz Game »</w:t>
+      </w:r>
+    </w:p>
+    <w:p>
+      <w:pPr>
+        <w:spacing w:before="0" w:after="0"/>
+        <w:ind w:left="624"/>
+      </w:pPr>
+      <w:r>
+        <w:rPr>
+          <w:color w:val="444455"/>
+          <w:sz w:val="21"/>
+        </w:rPr>
+        <w:t>1.5  Public cible</w:t>
+      </w:r>
+    </w:p>
+    <w:p>
+      <w:pPr>
+        <w:spacing w:before="140" w:after="40"/>
+      </w:pPr>
+      <w:r>
+        <w:rPr>
+          <w:b/>
+          <w:color w:val="5B4BD6"/>
+          <w:sz w:val="24"/>
+        </w:rPr>
+        <w:t>Chapitre 2 : Analyse et conception</w:t>
+      </w:r>
+    </w:p>
+    <w:p>
+      <w:pPr>
+        <w:spacing w:before="0" w:after="0"/>
+        <w:ind w:left="624"/>
+      </w:pPr>
+      <w:r>
+        <w:rPr>
+          <w:color w:val="444455"/>
+          <w:sz w:val="21"/>
+        </w:rPr>
+        <w:t>2.1  Cahier des charges</w:t>
+      </w:r>
+    </w:p>
+    <w:p>
+      <w:pPr>
+        <w:spacing w:before="0" w:after="0"/>
+        <w:ind w:left="624"/>
+      </w:pPr>
+      <w:r>
+        <w:rPr>
+          <w:color w:val="444455"/>
+          <w:sz w:val="21"/>
+        </w:rPr>
+        <w:t>2.2  Les fonctionnalités détaillées</w:t>
+      </w:r>
+    </w:p>
+    <w:p>
+      <w:pPr>
+        <w:spacing w:before="0" w:after="0"/>
+        <w:ind w:left="624"/>
+      </w:pPr>
+      <w:r>
+        <w:rPr>
+          <w:color w:val="444455"/>
+          <w:sz w:val="21"/>
+        </w:rPr>
+        <w:t>2.3  Description des écrans</w:t>
+      </w:r>
+    </w:p>
+    <w:p>
+      <w:pPr>
+        <w:spacing w:before="0" w:after="0"/>
+        <w:ind w:left="624"/>
+      </w:pPr>
+      <w:r>
+        <w:rPr>
+          <w:color w:val="444455"/>
+          <w:sz w:val="21"/>
+        </w:rPr>
+        <w:t>2.4  Enchaînement des écrans</w:t>
+      </w:r>
+    </w:p>
+    <w:p>
+      <w:pPr>
+        <w:spacing w:before="0" w:after="0"/>
+        <w:ind w:left="624"/>
+      </w:pPr>
+      <w:r>
+        <w:rPr>
+          <w:color w:val="444455"/>
+          <w:sz w:val="21"/>
+        </w:rPr>
+        <w:t>2.5  Organisation des données</w:t>
+      </w:r>
+    </w:p>
+    <w:p>
+      <w:pPr>
+        <w:spacing w:before="140" w:after="40"/>
+      </w:pPr>
+      <w:r>
+        <w:rPr>
+          <w:b/>
+          <w:color w:val="5B4BD6"/>
+          <w:sz w:val="24"/>
+        </w:rPr>
+        <w:t>Chapitre 3 : Technologies utilisées</w:t>
+      </w:r>
+    </w:p>
+    <w:p>
+      <w:pPr>
+        <w:spacing w:before="0" w:after="0"/>
+        <w:ind w:left="624"/>
+      </w:pPr>
+      <w:r>
+        <w:rPr>
+          <w:color w:val="444455"/>
+          <w:sz w:val="21"/>
+        </w:rPr>
+        <w:t>3.1  HTML5</w:t>
+      </w:r>
+    </w:p>
+    <w:p>
+      <w:pPr>
+        <w:spacing w:before="0" w:after="0"/>
+        <w:ind w:left="624"/>
+      </w:pPr>
+      <w:r>
+        <w:rPr>
+          <w:color w:val="444455"/>
+          <w:sz w:val="21"/>
+        </w:rPr>
+        <w:t>3.2  CSS3</w:t>
+      </w:r>
+    </w:p>
+    <w:p>
+      <w:pPr>
+        <w:spacing w:before="0" w:after="0"/>
+        <w:ind w:left="624"/>
+      </w:pPr>
+      <w:r>
+        <w:rPr>
+          <w:color w:val="444455"/>
+          <w:sz w:val="21"/>
+        </w:rPr>
+        <w:t>3.3  JavaScript</w:t>
+      </w:r>
+    </w:p>
+    <w:p>
+      <w:pPr>
+        <w:spacing w:before="0" w:after="0"/>
+        <w:ind w:left="624"/>
+      </w:pPr>
+      <w:r>
+        <w:rPr>
+          <w:color w:val="444455"/>
+          <w:sz w:val="21"/>
+        </w:rPr>
+        <w:t>3.4  Outils de développement</w:t>
+      </w:r>
+    </w:p>
+    <w:p>
+      <w:pPr>
+        <w:spacing w:before="140" w:after="40"/>
+      </w:pPr>
+      <w:r>
+        <w:rPr>
+          <w:b/>
+          <w:color w:val="5B4BD6"/>
+          <w:sz w:val="24"/>
+        </w:rPr>
+        <w:t>Chapitre 4 : Réalisation et implémentation</w:t>
+      </w:r>
+    </w:p>
+    <w:p>
+      <w:pPr>
+        <w:spacing w:before="0" w:after="0"/>
+        <w:ind w:left="624"/>
+      </w:pPr>
+      <w:r>
+        <w:rPr>
+          <w:color w:val="444455"/>
+          <w:sz w:val="21"/>
+        </w:rPr>
+        <w:t>4.1  Organisation du code</w:t>
+      </w:r>
+    </w:p>
+    <w:p>
+      <w:pPr>
+        <w:spacing w:before="0" w:after="0"/>
+        <w:ind w:left="624"/>
+      </w:pPr>
+      <w:r>
+        <w:rPr>
+          <w:color w:val="444455"/>
+          <w:sz w:val="21"/>
+        </w:rPr>
+        <w:t>4.2  La gestion du multilingue</w:t>
+      </w:r>
+    </w:p>
+    <w:p>
+      <w:pPr>
+        <w:spacing w:before="0" w:after="0"/>
+        <w:ind w:left="624"/>
+      </w:pPr>
+      <w:r>
+        <w:rPr>
+          <w:color w:val="444455"/>
+          <w:sz w:val="21"/>
+        </w:rPr>
+        <w:t>4.3  La banque de questions</w:t>
+      </w:r>
+    </w:p>
+    <w:p>
+      <w:pPr>
+        <w:spacing w:before="0" w:after="0"/>
+        <w:ind w:left="624"/>
+      </w:pPr>
+      <w:r>
+        <w:rPr>
+          <w:color w:val="444455"/>
+          <w:sz w:val="21"/>
+        </w:rPr>
+        <w:t>4.4  L'affichage dynamique des questions</w:t>
+      </w:r>
+    </w:p>
+    <w:p>
+      <w:pPr>
+        <w:spacing w:before="0" w:after="0"/>
+        <w:ind w:left="624"/>
+      </w:pPr>
+      <w:r>
+        <w:rPr>
+          <w:color w:val="444455"/>
+          <w:sz w:val="21"/>
+        </w:rPr>
+        <w:t>4.5  La gestion des réponses et du score</w:t>
+      </w:r>
+    </w:p>
+    <w:p>
+      <w:pPr>
+        <w:spacing w:before="0" w:after="0"/>
+        <w:ind w:left="624"/>
+      </w:pPr>
+      <w:r>
+        <w:rPr>
+          <w:color w:val="444455"/>
+          <w:sz w:val="21"/>
+        </w:rPr>
+        <w:t>4.6  Le minuteur</w:t>
+      </w:r>
+    </w:p>
+    <w:p>
+      <w:pPr>
+        <w:spacing w:before="0" w:after="0"/>
+        <w:ind w:left="624"/>
+      </w:pPr>
+      <w:r>
+        <w:rPr>
+          <w:color w:val="444455"/>
+          <w:sz w:val="21"/>
+        </w:rPr>
+        <w:t>4.7  Le système de niveaux et de déverrouillage</w:t>
+      </w:r>
+    </w:p>
+    <w:p>
+      <w:pPr>
+        <w:spacing w:before="0" w:after="0"/>
+        <w:ind w:left="624"/>
+      </w:pPr>
+      <w:r>
+        <w:rPr>
+          <w:color w:val="444455"/>
+          <w:sz w:val="21"/>
+        </w:rPr>
+        <w:t>4.8  La sauvegarde de la progression</w:t>
+      </w:r>
+    </w:p>
+    <w:p>
+      <w:pPr>
+        <w:spacing w:before="0" w:after="0"/>
+        <w:ind w:left="624"/>
+      </w:pPr>
+      <w:r>
+        <w:rPr>
+          <w:color w:val="444455"/>
+          <w:sz w:val="21"/>
+        </w:rPr>
+        <w:t>4.9  Les effets sonores</w:t>
+      </w:r>
+    </w:p>
+    <w:p>
+      <w:pPr>
+        <w:spacing w:before="140" w:after="40"/>
+      </w:pPr>
+      <w:r>
+        <w:rPr>
+          <w:b/>
+          <w:color w:val="5B4BD6"/>
+          <w:sz w:val="24"/>
+        </w:rPr>
+        <w:t>Conclusion et perspectives</w:t>
+      </w:r>
+    </w:p>
+    <w:p>
+      <w:pPr>
+        <w:spacing w:before="140" w:after="40"/>
+      </w:pPr>
+      <w:r>
+        <w:rPr>
+          <w:b/>
+          <w:color w:val="5B4BD6"/>
+          <w:sz w:val="24"/>
+        </w:rPr>
+        <w:t>Annexe : Code source complet</w:t>
+      </w:r>
+    </w:p>
+    <w:p>
+      <w:pPr>
+        <w:spacing w:before="0" w:after="0"/>
+        <w:ind w:left="624"/>
+      </w:pPr>
+      <w:r>
+        <w:rPr>
+          <w:color w:val="444455"/>
+          <w:sz w:val="21"/>
+        </w:rPr>
+        <w:t>Annexe A — Fichier index.html (structure)</w:t>
+      </w:r>
+    </w:p>
+    <w:p>
+      <w:pPr>
+        <w:spacing w:before="0" w:after="0"/>
+        <w:ind w:left="624"/>
+      </w:pPr>
+      <w:r>
+        <w:rPr>
+          <w:color w:val="444455"/>
+          <w:sz w:val="21"/>
+        </w:rPr>
+        <w:t>Annexe B — Fichier styles.css (style)</w:t>
+      </w:r>
+    </w:p>
+    <w:p>
+      <w:pPr>
+        <w:spacing w:before="0" w:after="0"/>
+        <w:ind w:left="624"/>
+      </w:pPr>
+      <w:r>
+        <w:rPr>
+          <w:color w:val="444455"/>
+          <w:sz w:val="21"/>
+        </w:rPr>
+        <w:t>Annexe C — Fichier script.js (logique)</w:t>
+      </w:r>
+    </w:p>
+    <w:p>
+      <w:pPr>
+        <w:spacing w:before="140" w:after="40"/>
+      </w:pPr>
+      <w:r>
+        <w:rPr>
+          <w:b/>
+          <w:color w:val="5B4BD6"/>
+          <w:sz w:val="24"/>
+        </w:rPr>
+        <w:t>Webographie</w:t>
       </w:r>
     </w:p>
     <w:p>
@@ -382,7 +828,7 @@
           <w:i w:val="0"/>
           <w:sz w:val="22"/>
         </w:rPr>
-        <w:t>Ce projet a été réalisé dans le cadre de notre formation en filière CP1 à l'Institut ISMAGI, sous l'encadrement du professeur Zidan. Il vise à appliquer, à travers un cas concret, les notions fondamentales du développement web front-end enseignées durant l'année.</w:t>
+        <w:t>Ce projet a été réalisé dans le cadre de notre formation en filière CP1 à l'Institut ISMAGI, sous l'encadrement du professeur Zidane Issam Eddine. Il vise à appliquer, à travers un cas concret, les notions fondamentales du développement web front-end enseignées durant l'année.</w:t>
       </w:r>
     </w:p>
     <w:p>
@@ -13548,7 +13994,6 @@
       </w:r>
     </w:p>
     <w:sectPr>
-      <w:footerReference w:type="default" r:id="rId9"/>
       <w:pgSz w:w="12240" w:h="15840"/>
       <w:pgMar w:top="1304" w:right="1417" w:bottom="1304" w:left="1417" w:header="720" w:footer="720" w:gutter="0"/>
       <w:cols w:space="720"/>
@@ -13556,22 +14001,6 @@
     </w:sectPr>
   </w:body>
 </w:document>
-</file>
-
-<file path=word/footer1.xml><?xml version="1.0" encoding="utf-8"?>
-<w:ftr xmlns:m="http://schemas.openxmlformats.org/officeDocument/2006/math" xmlns:mc="http://schemas.openxmlformats.org/markup-compatibility/2006" xmlns:mo="http://schemas.microsoft.com/office/mac/office/2008/main" xmlns:mv="urn:schemas-microsoft-com:mac:vml" xmlns:o="urn:schemas-microsoft-com:office:office" xmlns:r="http://schemas.openxmlformats.org/officeDocument/2006/relationships" xmlns:v="urn:schemas-microsoft-com:vml" xmlns:w10="urn:schemas-microsoft-com:office:word" xmlns:w14="http://schemas.microsoft.com/office/word/2010/wordml" xmlns:w="http://schemas.openxmlformats.org/wordprocessingml/2006/main" xmlns:wne="http://schemas.microsoft.com/office/word/2006/wordml" xmlns:wp14="http://schemas.microsoft.com/office/word/2010/wordprocessingDrawing" xmlns:wp="http://schemas.openxmlformats.org/drawingml/2006/wordprocessingDrawing" xmlns:wpc="http://schemas.microsoft.com/office/word/2010/wordprocessingCanvas" xmlns:wpg="http://schemas.microsoft.com/office/word/2010/wordprocessingGroup" xmlns:wpi="http://schemas.microsoft.com/office/word/2010/wordprocessingInk" xmlns:wps="http://schemas.microsoft.com/office/word/2010/wordprocessingShape" mc:Ignorable="w14 wp14">
-  <w:p>
-    <w:pPr>
-      <w:pStyle w:val="Footer"/>
-      <w:jc w:val="center"/>
-    </w:pPr>
-    <w:r>
-      <w:fldChar w:fldCharType="begin"/>
-      <w:instrText xml:space="preserve">PAGE</w:instrText>
-      <w:fldChar w:fldCharType="end"/>
-    </w:r>
-  </w:p>
-</w:ftr>
 </file>
 
 <file path=word/numbering.xml><?xml version="1.0" encoding="utf-8"?>

</xml_diff>